<commit_message>
Align general resume contact icons
</commit_message>
<xml_diff>
--- a/General_Resume_Template.docx
+++ b/General_Resume_Template.docx
@@ -82,7 +82,7 @@
       </w:r>
       <w:r>
         <w:rPr>
-          <w:position w:val="-2"/>
+          <w:position w:val="-1"/>
         </w:rPr>
         <w:drawing>
           <wp:inline xmlns:a="http://schemas.openxmlformats.org/drawingml/2006/main" xmlns:pic="http://schemas.openxmlformats.org/drawingml/2006/picture">
@@ -141,7 +141,7 @@
       </w:r>
       <w:r>
         <w:rPr>
-          <w:position w:val="-2"/>
+          <w:position w:val="-3"/>
         </w:rPr>
         <w:drawing>
           <wp:inline xmlns:a="http://schemas.openxmlformats.org/drawingml/2006/main" xmlns:pic="http://schemas.openxmlformats.org/drawingml/2006/picture">

</xml_diff>